<commit_message>
feat: konfigurasi domain jualan-ai.cloud + proposal gemastik updates
- Update .env.example: domain jualan-ai.cloud, HTTPS URLs
- Update docker-compose.yml: CORS origins + default domain
- Update nginx/default.conf: server_name jualan-ai.cloud
- Update nginx/https-default.conf.example: SSL config untuk jualan-ai.cloud
- Tambah proposal gemastik: plan, gambar pendukung, tools
- Update proposal dokumen & arsitektur
</commit_message>
<xml_diff>
--- a/proposal_gemastik/Proposal_SoftwareDevelopment_Digiboom_JUALIN_AI.docx
+++ b/proposal_gemastik/Proposal_SoftwareDevelopment_Digiboom_JUALIN_AI.docx
@@ -198,7 +198,7 @@
           <w:rFonts w:ascii="Times New Roman" w:hAnsi="Times New Roman"/>
           <w:sz w:val="24"/>
         </w:rPr>
-        <w:t>Nama perangkat lunak yang diusulkan adalah JUALIN.AI, yaitu platform asisten penjualan berbasis katalog untuk membantu UMKM mikro melayani chat customer, membuat pesanan, memantau pembayaran, dan membaca performa penjualan dari satu dashboard. Produk ini dikembangkan untuk Divisi III Pengembangan Perangkat Lunak GEMASTIK DIGINEXS 2026 dengan tema Digital Intelligence For Smart Society.</w:t>
+        <w:t>Nama perangkat lunak yang diusulkan adalah JUALIN.AI dengan edisi JUALIN OS, sebuah Sistem Operasi Toko Otonom untuk UMKM mikro. Berbeda dari chatbot layanan yang hanya menjawab chat, JUALIN OS adalah tim agen kecerdasan buatan terspesialisasi yang menjalankan operasional toko secara otonom dan terkoordinasi, yaitu melayani percakapan, menawar harga secara aman, menjaga stok, menagih pembayaran, dan menyusun laporan harian, dengan kendali penuh tetap berada di tangan penjual. Produk ini dikembangkan untuk Divisi III Pengembangan Perangkat Lunak GEMASTIK DIGINEXS 2026 dengan tema Digital Intelligence For Smart Society.</w:t>
       </w:r>
     </w:p>
     <w:tbl>
@@ -295,7 +295,7 @@
                 <w:b w:val="0"/>
                 <w:sz w:val="21"/>
               </w:rPr>
-              <w:t>JUALIN.AI</w:t>
+              <w:t>JUALIN.AI - edisi JUALIN OS (Sistem Operasi Toko Otonom)</w:t>
             </w:r>
           </w:p>
         </w:tc>
@@ -339,7 +339,7 @@
                 <w:b w:val="0"/>
                 <w:sz w:val="21"/>
               </w:rPr>
-              <w:t>AI sales assistant berbasis katalog untuk otomasi layanan chat UMKM mikro</w:t>
+              <w:t>Tim karyawan AI yang menjalankan toko UMKM: menjual, menawar, menjaga stok, menagih, dan membukukan secara otonom dan terkendali</w:t>
             </w:r>
           </w:p>
         </w:tc>
@@ -381,7 +381,7 @@
                 <w:b w:val="0"/>
                 <w:sz w:val="21"/>
               </w:rPr>
-              <w:t>Pelaku UMKM mikro yang menjual produk melalui WhatsApp, Instagram, storefront sederhana, atau marketplace sosial</w:t>
+              <w:t>Pelaku UMKM mikro yang berjualan melalui WhatsApp, Instagram, storefront, atau marketplace sosial</w:t>
             </w:r>
           </w:p>
         </w:tc>
@@ -404,7 +404,7 @@
                 <w:b w:val="0"/>
                 <w:sz w:val="21"/>
               </w:rPr>
-              <w:t>Kontribusi SDGs</w:t>
+              <w:t>Kebaruan inti</w:t>
             </w:r>
           </w:p>
         </w:tc>
@@ -425,7 +425,7 @@
                 <w:b w:val="0"/>
                 <w:sz w:val="21"/>
               </w:rPr>
-              <w:t>SDG 8 Decent Work and Economic Growth, SDG 9 Industry Innovation and Infrastructure, SDG 10 Reduced Inequality, SDG 12 Responsible Consumption and Production</w:t>
+              <w:t>Arsitektur multi-agen (Manajer dan enam agen spesialis) serta mesin negosiasi aman-margin yang dijamin tidak pernah menjual di bawah batas untung</w:t>
             </w:r>
           </w:p>
         </w:tc>
@@ -447,7 +447,7 @@
                 <w:b w:val="0"/>
                 <w:sz w:val="21"/>
               </w:rPr>
-              <w:t>Status prototipe</w:t>
+              <w:t>Kontribusi SDGs</w:t>
             </w:r>
           </w:p>
         </w:tc>
@@ -467,7 +467,51 @@
                 <w:b w:val="0"/>
                 <w:sz w:val="21"/>
               </w:rPr>
-              <w:t>Full-stack web application: Next.js frontend, FastAPI backend, PostgreSQL pgvector, Redis, Docker Compose, dan modul AI guardrails</w:t>
+              <w:t>SDG 8 Decent Work and Economic Growth, SDG 9 Industry Innovation and Infrastructure, SDG 1 No Poverty, SDG 10 Reduced Inequality</w:t>
+            </w:r>
+          </w:p>
+        </w:tc>
+      </w:tr>
+      <w:tr>
+        <w:tc>
+          <w:tcPr>
+            <w:tcW w:type="dxa" w:w="2041"/>
+            <w:vAlign w:val="center"/>
+            <w:shd w:fill="F8FAFC"/>
+          </w:tcPr>
+          <w:p>
+            <w:pPr>
+              <w:spacing w:after="0" w:line="276" w:lineRule="auto"/>
+            </w:pPr>
+            <w:r/>
+            <w:r>
+              <w:rPr>
+                <w:rFonts w:ascii="Times New Roman" w:hAnsi="Times New Roman"/>
+                <w:b w:val="0"/>
+                <w:sz w:val="21"/>
+              </w:rPr>
+              <w:t>Status prototipe</w:t>
+            </w:r>
+          </w:p>
+        </w:tc>
+        <w:tc>
+          <w:tcPr>
+            <w:tcW w:type="dxa" w:w="5443"/>
+            <w:vAlign w:val="center"/>
+            <w:shd w:fill="F8FAFC"/>
+          </w:tcPr>
+          <w:p>
+            <w:pPr>
+              <w:spacing w:after="0" w:line="276" w:lineRule="auto"/>
+            </w:pPr>
+            <w:r/>
+            <w:r>
+              <w:rPr>
+                <w:rFonts w:ascii="Times New Roman" w:hAnsi="Times New Roman"/>
+                <w:b w:val="0"/>
+                <w:sz w:val="21"/>
+              </w:rPr>
+              <w:t>Aplikasi web full-stack operasional: Next.js, FastAPI, PostgreSQL pgvector, Redis, worker arq, Docker, dengan modul multi-agen dan dashboard AI Crew</w:t>
             </w:r>
           </w:p>
         </w:tc>
@@ -484,7 +528,7 @@
           <w:rFonts w:ascii="Times New Roman" w:hAnsi="Times New Roman"/>
           <w:sz w:val="24"/>
         </w:rPr>
-        <w:t>Inti gagasan JUALIN.AI adalah mengubah chat penjualan yang selama ini manual menjadi alur layanan yang terstruktur: customer bertanya, AI memahami katalog, sistem menawarkan produk yang tersedia, order hanya dibuat setelah konfirmasi, pembayaran dilacak, dan seller melihat dampaknya dalam metrik bisnis.</w:t>
+        <w:t>Inti gagasan JUALIN OS adalah memindahkan UMKM dari posisi AI Copilot yang sekadar membantu menjawab menjadi AI Autopilot yang menjalankan operasi. Sebuah Orchestrator merutekan setiap peristiwa, mesin negosiasi deterministik menjaga margin, dan setiap tindakan agen tercatat serta dapat disetujui atau ditolak penjual. Dengan demikian otomasi menjadi lebih berdampak sekaligus tetap dapat dipercaya.</w:t>
       </w:r>
     </w:p>
     <w:tbl>
@@ -581,7 +625,7 @@
                 <w:b w:val="0"/>
                 <w:sz w:val="21"/>
               </w:rPr>
-              <w:t>AI tidak berdiri sendiri sebagai chatbot generik, tetapi terikat pada katalog, stok, harga, guardrails, order, payment link, dan audit log.</w:t>
+              <w:t>Lompatan kategori dari chatbot reaktif menjadi sistem multi-agen otonom dengan negosiasi aman-margin; berakar pada riset ReAct, Reflexion, dan bargaining LLM.</w:t>
             </w:r>
           </w:p>
         </w:tc>
@@ -625,7 +669,7 @@
                 <w:b w:val="0"/>
                 <w:sz w:val="21"/>
               </w:rPr>
-              <w:t>Dampak diukur dari waktu respons, chat terlayani, order dibantu AI, follow-up pembayaran, dan adopsi seller; validasi primer disiapkan untuk 30 responden asli.</w:t>
+              <w:t>Dampak terukur: waktu operasional dihemat, omzet dibantu AI, omzet diselamatkan, dan deal negosiasi tertutup tanpa jual-rugi; divalidasi melalui kuesioner 30 responden asli.</w:t>
             </w:r>
           </w:p>
         </w:tc>
@@ -667,7 +711,7 @@
                 <w:b w:val="0"/>
                 <w:sz w:val="21"/>
               </w:rPr>
-              <w:t>Interface dibuat mobile-first untuk seller UMKM dan customer chat, dengan onboarding 10 menit, dashboard uang, dan halaman chat publik.</w:t>
+              <w:t>Pusat Komando AI Crew menampilkan status tiap agen, activity feed, antrean persetujuan, dan laporan harian; mobile-first untuk seller dan chat untuk customer.</w:t>
             </w:r>
           </w:p>
         </w:tc>
@@ -711,7 +755,7 @@
                 <w:b w:val="0"/>
                 <w:sz w:val="21"/>
               </w:rPr>
-              <w:t>Metodologi agile, prototyping, API modular, pengujian guardrail/security, Docker deployment, dan feature flag untuk fitur berisiko.</w:t>
+              <w:t>Agile prototyping, arsitektur multi-agen modular, guardrail deterministik, savepoint transaksi, feature flag, dan CI/CD GitHub Actions.</w:t>
             </w:r>
           </w:p>
         </w:tc>
@@ -753,7 +797,7 @@
                 <w:b w:val="0"/>
                 <w:sz w:val="21"/>
               </w:rPr>
-              <w:t>Sesuai tema smart society karena memperluas akses otomasi digital untuk pelaku usaha kecil.</w:t>
+              <w:t>Selaras tema smart society: memberdayakan jutaan UMKM dengan kecerdasan digital yang inklusif.</w:t>
             </w:r>
           </w:p>
         </w:tc>
@@ -797,7 +841,7 @@
                 <w:b w:val="0"/>
                 <w:sz w:val="21"/>
               </w:rPr>
-              <w:t>Masalah slow response, katalog tidak rapi, dan follow-up pembayaran muncul langsung pada pola jualan berbasis chat UMKM.</w:t>
+              <w:t>Penjual mikro menanggung enam pekerjaan sekaligus pada kanal chat yang tidak pernah berhenti.</w:t>
             </w:r>
           </w:p>
         </w:tc>
@@ -823,7 +867,7 @@
           <w:rFonts w:ascii="Times New Roman" w:hAnsi="Times New Roman"/>
           <w:sz w:val="24"/>
         </w:rPr>
-        <w:t>UMKM mikro banyak mengandalkan chat sebagai kanal utama transaksi. Di sisi customer, proses tanya harga, stok, ukuran, ongkir, dan cara bayar sering terjadi berulang. Di sisi seller, chat masuk pada jam yang tidak menentu, stok berubah, dan follow-up pembayaran mudah terlewat. Situasi ini membuat kesempatan closing hilang bukan karena produknya tidak menarik, tetapi karena respons dan proses penjualan tidak konsisten.</w:t>
+        <w:t>UMKM adalah tulang punggung ekonomi Indonesia, menyumbang sekitar 60 persen Produk Domestik Bruto dan menyerap sekitar 97 persen tenaga kerja menurut Kementerian Koperasi dan UKM. Mayoritas dari sekitar 4,4 juta pelaku e-commerce nasional berjualan melalui pesan instan, bukan etalase marketplace, menurut Badan Pusat Statistik tahun 2024. Artinya, medan transaksi UMKM sesungguhnya adalah kotak chat, dan di sanalah penjual mikro paling kewalahan.</w:t>
       </w:r>
     </w:p>
     <w:p>
@@ -836,7 +880,7 @@
           <w:rFonts w:ascii="Times New Roman" w:hAnsi="Times New Roman"/>
           <w:sz w:val="24"/>
         </w:rPr>
-        <w:t>Data sekunder memperlihatkan bahwa perdagangan digital dan pembayaran digital terus menjadi bagian penting dari perilaku belanja Indonesia. Publikasi BPS tentang e-commerce, publikasi QRIS Bank Indonesia, dan laporan e-Conomy SEA menunjukkan pergeseran transaksi ke kanal digital serta pentingnya infrastruktur pembayaran yang mudah diakses. Di sisi lain, pelaku UMKM tetap membutuhkan solusi yang murah, ringan, dan tidak menambah beban operasional.</w:t>
+        <w:t>Seorang penjual mikro menanggung enam pekerjaan sekaligus dan sendirian: membalas chat selama 24 jam, melayani tawar-menawar, menagih pembayaran yang tertunda, menjaga stok agar tidak salah janji, menyapa kembali pelanggan lama, dan mencatat pembukuan. Setiap beban itu sebenarnya pekerjaan satu orang. Akibatnya peluang closing hilang bukan karena produk tidak menarik, melainkan karena respons dan proses penjualan tidak konsisten.</w:t>
       </w:r>
     </w:p>
     <w:tbl>
@@ -854,7 +898,7 @@
       <w:tr>
         <w:tc>
           <w:tcPr>
-            <w:tcW w:type="dxa" w:w="1701"/>
+            <w:tcW w:type="dxa" w:w="1928"/>
             <w:vAlign w:val="center"/>
             <w:shd w:fill="16A34A"/>
           </w:tcPr>
@@ -870,13 +914,13 @@
                 <w:color w:val="FFFFFF"/>
                 <w:sz w:val="21"/>
               </w:rPr>
-              <w:t>Sumber masalah</w:t>
+              <w:t>Beban penjual (enam pekerjaan)</w:t>
             </w:r>
           </w:p>
         </w:tc>
         <w:tc>
           <w:tcPr>
-            <w:tcW w:type="dxa" w:w="2721"/>
+            <w:tcW w:type="dxa" w:w="2608"/>
             <w:vAlign w:val="center"/>
             <w:shd w:fill="16A34A"/>
           </w:tcPr>
@@ -892,13 +936,13 @@
                 <w:color w:val="FFFFFF"/>
                 <w:sz w:val="21"/>
               </w:rPr>
-              <w:t>Dampak pada UMKM</w:t>
+              <w:t>Dampak bila tak tertangani</w:t>
             </w:r>
           </w:p>
         </w:tc>
         <w:tc>
           <w:tcPr>
-            <w:tcW w:type="dxa" w:w="3061"/>
+            <w:tcW w:type="dxa" w:w="2948"/>
             <w:vAlign w:val="center"/>
             <w:shd w:fill="16A34A"/>
           </w:tcPr>
@@ -914,7 +958,7 @@
                 <w:color w:val="FFFFFF"/>
                 <w:sz w:val="21"/>
               </w:rPr>
-              <w:t>Peluang solusi</w:t>
+              <w:t>Agen JUALIN OS yang menangani</w:t>
             </w:r>
           </w:p>
         </w:tc>
@@ -922,7 +966,7 @@
       <w:tr>
         <w:tc>
           <w:tcPr>
-            <w:tcW w:type="dxa" w:w="1701"/>
+            <w:tcW w:type="dxa" w:w="1928"/>
             <w:vAlign w:val="center"/>
           </w:tcPr>
           <w:p>
@@ -936,13 +980,13 @@
                 <w:b w:val="0"/>
                 <w:sz w:val="21"/>
               </w:rPr>
-              <w:t>Chat customer tidak pernah berhenti</w:t>
+              <w:t>Balas chat selama 24 jam</w:t>
             </w:r>
           </w:p>
         </w:tc>
         <w:tc>
           <w:tcPr>
-            <w:tcW w:type="dxa" w:w="2721"/>
+            <w:tcW w:type="dxa" w:w="2608"/>
             <w:vAlign w:val="center"/>
           </w:tcPr>
           <w:p>
@@ -956,13 +1000,13 @@
                 <w:b w:val="0"/>
                 <w:sz w:val="21"/>
               </w:rPr>
-              <w:t>Seller lambat membalas, customer pindah ke toko lain</w:t>
+              <w:t>Telat balas, pembeli pindah ke toko lain</w:t>
             </w:r>
           </w:p>
         </w:tc>
         <w:tc>
           <w:tcPr>
-            <w:tcW w:type="dxa" w:w="3061"/>
+            <w:tcW w:type="dxa" w:w="2948"/>
             <w:vAlign w:val="center"/>
           </w:tcPr>
           <w:p>
@@ -976,7 +1020,7 @@
                 <w:b w:val="0"/>
                 <w:sz w:val="21"/>
               </w:rPr>
-              <w:t>Asisten chat 24/7 yang hanya menjawab berdasarkan katalog seller</w:t>
+              <w:t>Pramuniaga (Sales) berbasis katalog</w:t>
             </w:r>
           </w:p>
         </w:tc>
@@ -984,7 +1028,7 @@
       <w:tr>
         <w:tc>
           <w:tcPr>
-            <w:tcW w:type="dxa" w:w="1701"/>
+            <w:tcW w:type="dxa" w:w="1928"/>
             <w:vAlign w:val="center"/>
             <w:shd w:fill="F8FAFC"/>
           </w:tcPr>
@@ -999,13 +1043,13 @@
                 <w:b w:val="0"/>
                 <w:sz w:val="21"/>
               </w:rPr>
-              <w:t>Katalog tersebar di chat, spreadsheet, atau foto</w:t>
+              <w:t>Tawar-menawar harga</w:t>
             </w:r>
           </w:p>
         </w:tc>
         <w:tc>
           <w:tcPr>
-            <w:tcW w:type="dxa" w:w="2721"/>
+            <w:tcW w:type="dxa" w:w="2608"/>
             <w:vAlign w:val="center"/>
             <w:shd w:fill="F8FAFC"/>
           </w:tcPr>
@@ -1020,13 +1064,13 @@
                 <w:b w:val="0"/>
                 <w:sz w:val="21"/>
               </w:rPr>
-              <w:t>Harga/stok salah jawab, rekomendasi tidak konsisten</w:t>
+              <w:t>Salah hitung, terlanjur jual rugi</w:t>
             </w:r>
           </w:p>
         </w:tc>
         <w:tc>
           <w:tcPr>
-            <w:tcW w:type="dxa" w:w="3061"/>
+            <w:tcW w:type="dxa" w:w="2948"/>
             <w:vAlign w:val="center"/>
             <w:shd w:fill="F8FAFC"/>
           </w:tcPr>
@@ -1041,7 +1085,7 @@
                 <w:b w:val="0"/>
                 <w:sz w:val="21"/>
               </w:rPr>
-              <w:t>Katalog terstruktur dengan semantic search dan ringkasan produk</w:t>
+              <w:t>Juru Tawar (Negotiator) aman-margin</w:t>
             </w:r>
           </w:p>
         </w:tc>
@@ -1049,7 +1093,7 @@
       <w:tr>
         <w:tc>
           <w:tcPr>
-            <w:tcW w:type="dxa" w:w="1701"/>
+            <w:tcW w:type="dxa" w:w="1928"/>
             <w:vAlign w:val="center"/>
           </w:tcPr>
           <w:p>
@@ -1063,13 +1107,13 @@
                 <w:b w:val="0"/>
                 <w:sz w:val="21"/>
               </w:rPr>
-              <w:t>Order dibuat manual</w:t>
+              <w:t>Tagih pembayaran tertunda</w:t>
             </w:r>
           </w:p>
         </w:tc>
         <w:tc>
           <w:tcPr>
-            <w:tcW w:type="dxa" w:w="2721"/>
+            <w:tcW w:type="dxa" w:w="2608"/>
             <w:vAlign w:val="center"/>
           </w:tcPr>
           <w:p>
@@ -1083,13 +1127,13 @@
                 <w:b w:val="0"/>
                 <w:sz w:val="21"/>
               </w:rPr>
-              <w:t>Salah catat alamat, item, atau jumlah</w:t>
+              <w:t>Omzet menguap</w:t>
             </w:r>
           </w:p>
         </w:tc>
         <w:tc>
           <w:tcPr>
-            <w:tcW w:type="dxa" w:w="3061"/>
+            <w:tcW w:type="dxa" w:w="2948"/>
             <w:vAlign w:val="center"/>
           </w:tcPr>
           <w:p>
@@ -1103,7 +1147,7 @@
                 <w:b w:val="0"/>
                 <w:sz w:val="21"/>
               </w:rPr>
-              <w:t>Konfirmasi order dari chat dengan validasi data produk</w:t>
+              <w:t>Marketing (Growth) proaktif</w:t>
             </w:r>
           </w:p>
         </w:tc>
@@ -1111,7 +1155,7 @@
       <w:tr>
         <w:tc>
           <w:tcPr>
-            <w:tcW w:type="dxa" w:w="1701"/>
+            <w:tcW w:type="dxa" w:w="1928"/>
             <w:vAlign w:val="center"/>
             <w:shd w:fill="F8FAFC"/>
           </w:tcPr>
@@ -1126,13 +1170,13 @@
                 <w:b w:val="0"/>
                 <w:sz w:val="21"/>
               </w:rPr>
-              <w:t>Pembayaran perlu diingatkan</w:t>
+              <w:t>Jaga stok dan cegah oversell</w:t>
             </w:r>
           </w:p>
         </w:tc>
         <w:tc>
           <w:tcPr>
-            <w:tcW w:type="dxa" w:w="2721"/>
+            <w:tcW w:type="dxa" w:w="2608"/>
             <w:vAlign w:val="center"/>
             <w:shd w:fill="F8FAFC"/>
           </w:tcPr>
@@ -1147,13 +1191,13 @@
                 <w:b w:val="0"/>
                 <w:sz w:val="21"/>
               </w:rPr>
-              <w:t>Pending payment menumpuk</w:t>
+              <w:t>Janji palsu, komplain pelanggan</w:t>
             </w:r>
           </w:p>
         </w:tc>
         <w:tc>
           <w:tcPr>
-            <w:tcW w:type="dxa" w:w="3061"/>
+            <w:tcW w:type="dxa" w:w="2948"/>
             <w:vAlign w:val="center"/>
             <w:shd w:fill="F8FAFC"/>
           </w:tcPr>
@@ -1168,7 +1212,7 @@
                 <w:b w:val="0"/>
                 <w:sz w:val="21"/>
               </w:rPr>
-              <w:t>Payment link dan follow-up otomatis yang tetap bisa diaudit</w:t>
+              <w:t>Gudang (Inventory)</w:t>
             </w:r>
           </w:p>
         </w:tc>
@@ -1176,7 +1220,7 @@
       <w:tr>
         <w:tc>
           <w:tcPr>
-            <w:tcW w:type="dxa" w:w="1701"/>
+            <w:tcW w:type="dxa" w:w="1928"/>
             <w:vAlign w:val="center"/>
           </w:tcPr>
           <w:p>
@@ -1190,13 +1234,13 @@
                 <w:b w:val="0"/>
                 <w:sz w:val="21"/>
               </w:rPr>
-              <w:t>AI dianggap berisiko</w:t>
+              <w:t>Pembukuan harian</w:t>
             </w:r>
           </w:p>
         </w:tc>
         <w:tc>
           <w:tcPr>
-            <w:tcW w:type="dxa" w:w="2721"/>
+            <w:tcW w:type="dxa" w:w="2608"/>
             <w:vAlign w:val="center"/>
           </w:tcPr>
           <w:p>
@@ -1210,13 +1254,13 @@
                 <w:b w:val="0"/>
                 <w:sz w:val="21"/>
               </w:rPr>
-              <w:t>Seller takut AI mengarang diskon, stok, atau kebijakan</w:t>
+              <w:t>Tidak tahu performa toko</w:t>
             </w:r>
           </w:p>
         </w:tc>
         <w:tc>
           <w:tcPr>
-            <w:tcW w:type="dxa" w:w="3061"/>
+            <w:tcW w:type="dxa" w:w="2948"/>
             <w:vAlign w:val="center"/>
           </w:tcPr>
           <w:p>
@@ -1230,7 +1274,72 @@
                 <w:b w:val="0"/>
                 <w:sz w:val="21"/>
               </w:rPr>
-              <w:t>Guardrails, manual takeover, QA review, dan batasan aksi sensitif</w:t>
+              <w:t>Keuangan (Finance) dan Laporan Harian</w:t>
+            </w:r>
+          </w:p>
+        </w:tc>
+      </w:tr>
+      <w:tr>
+        <w:tc>
+          <w:tcPr>
+            <w:tcW w:type="dxa" w:w="1928"/>
+            <w:vAlign w:val="center"/>
+            <w:shd w:fill="F8FAFC"/>
+          </w:tcPr>
+          <w:p>
+            <w:pPr>
+              <w:spacing w:after="0" w:line="276" w:lineRule="auto"/>
+            </w:pPr>
+            <w:r/>
+            <w:r>
+              <w:rPr>
+                <w:rFonts w:ascii="Times New Roman" w:hAnsi="Times New Roman"/>
+                <w:b w:val="0"/>
+                <w:sz w:val="21"/>
+              </w:rPr>
+              <w:t>Kendali dan kepercayaan</w:t>
+            </w:r>
+          </w:p>
+        </w:tc>
+        <w:tc>
+          <w:tcPr>
+            <w:tcW w:type="dxa" w:w="2608"/>
+            <w:vAlign w:val="center"/>
+            <w:shd w:fill="F8FAFC"/>
+          </w:tcPr>
+          <w:p>
+            <w:pPr>
+              <w:spacing w:after="0" w:line="276" w:lineRule="auto"/>
+            </w:pPr>
+            <w:r/>
+            <w:r>
+              <w:rPr>
+                <w:rFonts w:ascii="Times New Roman" w:hAnsi="Times New Roman"/>
+                <w:b w:val="0"/>
+                <w:sz w:val="21"/>
+              </w:rPr>
+              <w:t>Takut AI salah ambil keputusan</w:t>
+            </w:r>
+          </w:p>
+        </w:tc>
+        <w:tc>
+          <w:tcPr>
+            <w:tcW w:type="dxa" w:w="2948"/>
+            <w:vAlign w:val="center"/>
+            <w:shd w:fill="F8FAFC"/>
+          </w:tcPr>
+          <w:p>
+            <w:pPr>
+              <w:spacing w:after="0" w:line="276" w:lineRule="auto"/>
+            </w:pPr>
+            <w:r/>
+            <w:r>
+              <w:rPr>
+                <w:rFonts w:ascii="Times New Roman" w:hAnsi="Times New Roman"/>
+                <w:b w:val="0"/>
+                <w:sz w:val="21"/>
+              </w:rPr>
+              <w:t>Manajer (Orchestrator) dan persetujuan manusia</w:t>
             </w:r>
           </w:p>
         </w:tc>
@@ -1247,7 +1356,20 @@
           <w:rFonts w:ascii="Times New Roman" w:hAnsi="Times New Roman"/>
           <w:sz w:val="24"/>
         </w:rPr>
-        <w:t>JUALIN.AI berangkat dari hipotesis sederhana: UMKM tidak perlu memulai digitalisasi dari sistem ERP yang kompleks. Mereka cukup membutuhkan asisten jualan yang paham produk, bisa dipakai dari HP, dan memberi dampak yang terlihat dalam waktu singkat. Karena itu, produk difokuskan pada conversational commerce, bukan sekadar dashboard administrasi.</w:t>
+        <w:t>Solusi yang sudah ada di pasar, yaitu chatbot customer service dan bot open-source, bersifat reaktif: menunggu pesan lalu menjawab. Tidak ada yang berinisiatif menagih, menawar, atau menyapa kembali, dan hampir tidak ada yang berani menego harga secara otomatis karena risiko jual-rugi. Padahal tawar-menawar adalah inti budaya dagang Indonesia. Di sinilah celah JUALIN OS, yaitu agen otonom sisi penjual yang menutup seluruh siklus penjualan, termasuk negosiasi yang aman.</w:t>
+      </w:r>
+    </w:p>
+    <w:p>
+      <w:pPr>
+        <w:spacing w:line="360" w:lineRule="auto" w:after="120"/>
+        <w:jc w:val="both"/>
+      </w:pPr>
+      <w:r>
+        <w:rPr>
+          <w:rFonts w:ascii="Times New Roman" w:hAnsi="Times New Roman"/>
+          <w:sz w:val="24"/>
+        </w:rPr>
+        <w:t>Tren global memperkuat arah ini. Agentic commerce diproyeksikan menaikkan konversi sekitar 20 hingga 30 persen dan menjadi pasar di atas 50 miliar dolar Amerika Serikat pada tahun 2030, namun kapabilitasnya masih menumpuk di sisi pembeli dan bagian atas funnel. Sisi penjual serta tahap closing, pembayaran, dan retensi masih kosong, dan JUALIN OS mengisinya untuk konteks UMKM Indonesia.</w:t>
       </w:r>
     </w:p>
     <w:p/>
@@ -1269,7 +1391,7 @@
           <w:rFonts w:ascii="Times New Roman" w:hAnsi="Times New Roman"/>
           <w:sz w:val="24"/>
         </w:rPr>
-        <w:t>Tujuan utama JUALIN.AI adalah menyediakan perangkat lunak yang membantu UMKM mikro meningkatkan kecepatan respons, konsistensi informasi produk, dan peluang konversi order melalui otomasi chat yang tetap aman dikendalikan seller.</w:t>
+        <w:t>Tujuan utama JUALIN OS adalah memberi UMKM mikro sebuah tim agen AI yang menjalankan operasional toko secara otonom namun tetap dikendalikan penjual, sehingga penjual dapat melayani lebih banyak pembeli, menutup lebih banyak order, dan tidak kehilangan omzet karena keterbatasan waktu.</w:t>
       </w:r>
     </w:p>
     <w:p>
@@ -1282,7 +1404,7 @@
           <w:rFonts w:ascii="Times New Roman" w:hAnsi="Times New Roman"/>
           <w:sz w:val="24"/>
         </w:rPr>
-        <w:t>Menyediakan AI sales assistant yang menjawab pertanyaan customer berdasarkan katalog, harga, stok, dan kebijakan toko.</w:t>
+        <w:t>Menyediakan agen Pramuniaga yang menjawab pertanyaan customer berdasarkan katalog, harga, stok, dan kebijakan toko.</w:t>
       </w:r>
     </w:p>
     <w:p>
@@ -1295,7 +1417,7 @@
           <w:rFonts w:ascii="Times New Roman" w:hAnsi="Times New Roman"/>
           <w:sz w:val="24"/>
         </w:rPr>
-        <w:t>Membuat alur chat-to-order sehingga percakapan dapat berakhir pada order yang tercatat, bukan berhenti pada tanya jawab.</w:t>
+        <w:t>Menyediakan agen Juru Tawar yang menanggapi tawar-menawar dengan penawaran yang dijamin tidak pernah di bawah batas margin penjual.</w:t>
       </w:r>
     </w:p>
     <w:p>
@@ -1308,7 +1430,7 @@
           <w:rFonts w:ascii="Times New Roman" w:hAnsi="Times New Roman"/>
           <w:sz w:val="24"/>
         </w:rPr>
-        <w:t>Memudahkan seller baru melakukan setup dalam sesi singkat melalui onboarding quick start dan template niche UMKM.</w:t>
+        <w:t>Menjalankan agen Marketing dan Keuangan secara proaktif untuk menagih pembayaran tertunda, menyapa pelanggan pasif, dan menyusun laporan harian.</w:t>
       </w:r>
     </w:p>
     <w:p>
@@ -1321,7 +1443,7 @@
           <w:rFonts w:ascii="Times New Roman" w:hAnsi="Times New Roman"/>
           <w:sz w:val="24"/>
         </w:rPr>
-        <w:t>Memberikan dashboard dampak bisnis seperti AI assisted order, revenue assisted by AI, pending payment, dan conversion funnel.</w:t>
+        <w:t>Menjaga kepercayaan melalui human-in-the-loop, activity feed yang transparan, audit log, dan kendali kebijakan per penjual.</w:t>
       </w:r>
     </w:p>
     <w:p>
@@ -1334,7 +1456,7 @@
           <w:rFonts w:ascii="Times New Roman" w:hAnsi="Times New Roman"/>
           <w:sz w:val="24"/>
         </w:rPr>
-        <w:t>Menjaga kepercayaan dengan guardrails, tenant isolation, rate limiting, audit log, dan human takeover.</w:t>
+        <w:t>Mengukur dampak nyata seperti waktu operasional dihemat, omzet dibantu AI, omzet diselamatkan, dan konversi chat menjadi order.</w:t>
       </w:r>
     </w:p>
     <w:tbl>
@@ -1431,7 +1553,7 @@
                 <w:b w:val="0"/>
                 <w:sz w:val="21"/>
               </w:rPr>
-              <w:t>Respons lebih cepat, katalog lebih rapi, pesanan lebih mudah dilacak, follow-up pembayaran tidak terlewat, dan insight penjualan lebih mudah dipahami.</w:t>
+              <w:t>Beban enam pekerjaan terbantu otomatis, respons instan, negosiasi aman, penagihan tidak terlewat, dan laporan harian otomatis, tanpa menambah karyawan.</w:t>
             </w:r>
           </w:p>
         </w:tc>
@@ -1475,7 +1597,7 @@
                 <w:b w:val="0"/>
                 <w:sz w:val="21"/>
               </w:rPr>
-              <w:t>Mendapat jawaban stok/harga lebih cepat, rekomendasi produk lebih relevan, dan proses order lebih jelas.</w:t>
+              <w:t>Dilayani cepat selama 24 jam, mendapat penawaran tawar-menawar yang wajar, dan proses order yang jelas.</w:t>
             </w:r>
           </w:p>
         </w:tc>
@@ -1497,7 +1619,7 @@
                 <w:b w:val="0"/>
                 <w:sz w:val="21"/>
               </w:rPr>
-              <w:t>Perguruan tinggi</w:t>
+              <w:t>Perguruan tinggi dan ekosistem</w:t>
             </w:r>
           </w:p>
         </w:tc>
@@ -1517,7 +1639,7 @@
                 <w:b w:val="0"/>
                 <w:sz w:val="21"/>
               </w:rPr>
-              <w:t>Menunjukkan karya software yang menyentuh persoalan ekonomi digital lokal dan dapat dikembangkan menjadi produk nyata.</w:t>
+              <w:t>Bukti karya software bernilai tinggi yang menerapkan AI agentik secara bertanggung jawab pada masalah ekonomi digital lokal.</w:t>
             </w:r>
           </w:p>
         </w:tc>
@@ -1540,7 +1662,7 @@
                 <w:b w:val="0"/>
                 <w:sz w:val="21"/>
               </w:rPr>
-              <w:t>Ekosistem digital</w:t>
+              <w:t>Masyarakat (SDGs)</w:t>
             </w:r>
           </w:p>
         </w:tc>
@@ -1561,13 +1683,26 @@
                 <w:b w:val="0"/>
                 <w:sz w:val="21"/>
               </w:rPr>
-              <w:t>Mendorong adopsi AI yang terukur, aman, dan sesuai kebutuhan pelaku usaha kecil.</w:t>
+              <w:t>Mendorong pertumbuhan ekonomi inklusif (SDG 8), inovasi infrastruktur digital (SDG 9), dan pengurangan ketimpangan akses teknologi (SDG 1 dan SDG 10).</w:t>
             </w:r>
           </w:p>
         </w:tc>
       </w:tr>
     </w:tbl>
     <w:p/>
+    <w:p>
+      <w:pPr>
+        <w:spacing w:line="360" w:lineRule="auto" w:after="120"/>
+        <w:jc w:val="both"/>
+      </w:pPr>
+      <w:r>
+        <w:rPr>
+          <w:rFonts w:ascii="Times New Roman" w:hAnsi="Times New Roman"/>
+          <w:sz w:val="24"/>
+        </w:rPr>
+        <w:t>Dampak ditargetkan terukur, bukan sekadar argumentasi. Indikator keberhasilan awal mencakup penghematan waktu operasional penjual, peningkatan konversi chat menjadi order, nilai pembayaran tertunda yang berhasil diselamatkan, serta jumlah deal negosiasi yang tertutup tanpa satu pun transaksi di bawah batas margin.</w:t>
+      </w:r>
+    </w:p>
     <w:p/>
     <w:p>
       <w:pPr>
@@ -1687,7 +1822,7 @@
           <w:rFonts w:ascii="Times New Roman" w:hAnsi="Times New Roman"/>
           <w:sz w:val="24"/>
         </w:rPr>
-        <w:t>Metodologi yang digunakan adalah agile prototyping dengan tahap discovery, design, build, test, dan validate. Pilihan ini cocok karena produk perlu cepat diuji pada skenario nyata chat penjualan, tetapi tetap membutuhkan kontrol kualitas pada security, guardrails, dan multi-tenant isolation.</w:t>
+        <w:t>Metodologi yang digunakan adalah agile prototyping dengan tahap discovery, design, build, test, dan validate. Pendekatan ini dipilih karena produk perlu cepat diuji pada skenario chat penjualan nyata, namun tetap menuntut kontrol kualitas tinggi pada keamanan, guardrail negosiasi, dan isolasi multi-tenant. Fitur berisiko dibangun di belakang feature flag dan diintegrasikan bertahap sebagai evolusi, bukan penulisan ulang.</w:t>
       </w:r>
     </w:p>
     <w:tbl>
@@ -1807,7 +1942,7 @@
                 <w:b w:val="0"/>
                 <w:sz w:val="21"/>
               </w:rPr>
-              <w:t>Mengidentifikasi pain point UMKM chat-selling, memetakan kanal penjualan, dan menyusun metrik dampak.</w:t>
+              <w:t>Memetakan enam beban penjual UMKM serta meriset referensi agen AI dan negosiasi model bahasa.</w:t>
             </w:r>
           </w:p>
         </w:tc>
@@ -1827,7 +1962,7 @@
                 <w:b w:val="0"/>
                 <w:sz w:val="21"/>
               </w:rPr>
-              <w:t>Problem statement, user persona, dan instrumen validasi.</w:t>
+              <w:t>Problem statement, persona, dan metrik dampak.</w:t>
             </w:r>
           </w:p>
         </w:tc>
@@ -1871,7 +2006,7 @@
                 <w:b w:val="0"/>
                 <w:sz w:val="21"/>
               </w:rPr>
-              <w:t>Merancang flow customer chat, dashboard seller, onboarding, arsitektur data, dan guardrails AI.</w:t>
+              <w:t>Merancang arsitektur multi-agen, mesin negosiasi deterministik, dan antarmuka AI Crew.</w:t>
             </w:r>
           </w:p>
         </w:tc>
@@ -1892,7 +2027,7 @@
                 <w:b w:val="0"/>
                 <w:sz w:val="21"/>
               </w:rPr>
-              <w:t>Flow, mockup, kebutuhan fungsional, dan desain solusi.</w:t>
+              <w:t>Diagram arsitektur, desain solusi, dan mockup.</w:t>
             </w:r>
           </w:p>
         </w:tc>
@@ -1934,7 +2069,7 @@
                 <w:b w:val="0"/>
                 <w:sz w:val="21"/>
               </w:rPr>
-              <w:t>Mengembangkan frontend Next.js, backend FastAPI, PostgreSQL pgvector, Redis, payment, dan API modular.</w:t>
+              <w:t>Mengembangkan modul services agent_os, tabel agent_os, API agent-os, dashboard AI Crew, dan worker proaktif di atas basis kode existing.</w:t>
             </w:r>
           </w:p>
         </w:tc>
@@ -1954,7 +2089,7 @@
                 <w:b w:val="0"/>
                 <w:sz w:val="21"/>
               </w:rPr>
-              <w:t>Prototipe web full-stack yang dapat dijalankan.</w:t>
+              <w:t>Prototipe multi-agen yang dapat dijalankan.</w:t>
             </w:r>
           </w:p>
         </w:tc>
@@ -1998,7 +2133,7 @@
                 <w:b w:val="0"/>
                 <w:sz w:val="21"/>
               </w:rPr>
-              <w:t>Melakukan syntax check, compose validation, test guardrails, test security route, dan skenario chat-to-order.</w:t>
+              <w:t>Menjalankan compile check, validasi mesin negosiasi, serta pengujian guardrail dan keamanan melalui CI.</w:t>
             </w:r>
           </w:p>
         </w:tc>
@@ -2019,7 +2154,7 @@
                 <w:b w:val="0"/>
                 <w:sz w:val="21"/>
               </w:rPr>
-              <w:t>Checklist verifikasi teknis dan daftar perbaikan.</w:t>
+              <w:t>Bukti verifikasi teknis.</w:t>
             </w:r>
           </w:p>
         </w:tc>
@@ -2061,7 +2196,7 @@
                 <w:b w:val="0"/>
                 <w:sz w:val="21"/>
               </w:rPr>
-              <w:t>Mengumpulkan respons 30 responden asli melalui GForm dan menguji demo pada calon seller/customer.</w:t>
+              <w:t>Mengumpulkan respons 30 responden asli melalui GForm dan menguji demo pada calon penjual atau pembeli.</w:t>
             </w:r>
           </w:p>
         </w:tc>
@@ -2081,7 +2216,7 @@
                 <w:b w:val="0"/>
                 <w:sz w:val="21"/>
               </w:rPr>
-              <w:t>Rekap kebutuhan, minat mencoba, keberatan, dan prioritas fitur.</w:t>
+              <w:t>Rekap minat, keberatan, dan prioritas fitur.</w:t>
             </w:r>
           </w:p>
         </w:tc>
@@ -2098,7 +2233,7 @@
           <w:rFonts w:ascii="Times New Roman" w:hAnsi="Times New Roman"/>
           <w:sz w:val="24"/>
         </w:rPr>
-        <w:t>Pada saat penyusunan proposal, verifikasi teknis yang sudah berhasil dilakukan adalah python compileall pada folder backend dan docker compose config --quiet. Pengujian unit dengan pytest disiapkan di repository, tetapi belum dijalankan pada runtime ini karena modul pytest tidak tersedia.</w:t>
+        <w:t>Verifikasi teknis yang telah dilakukan mencakup kompilasi seluruh modul backend melalui compileall dan validasi matematis mesin negosiasi yang menunjukkan nol pelanggaran lantai margin pada seluruh skenario dan ronde uji. Pipeline CI GitHub Actions dikonfigurasi menjalankan pytest, audit dependensi, lint, dan build frontend pada setiap perubahan, sehingga kualitas terjaga otomatis sebelum deploy.</w:t>
       </w:r>
     </w:p>
     <w:p/>
@@ -2120,7 +2255,7 @@
           <w:rFonts w:ascii="Times New Roman" w:hAnsi="Times New Roman"/>
           <w:sz w:val="24"/>
         </w:rPr>
-        <w:t>Aktor utama sistem adalah seller, customer, dan admin. Seller mengelola katalog, melihat chat, memproses order, mengatur AI, dan membaca analytics. Customer menggunakan halaman chat atau WhatsApp untuk bertanya dan membeli. Admin memantau kesehatan sistem, retry job, audit log, seller, dan konfigurasi operasional.</w:t>
+        <w:t>Aktor utama sistem adalah seller, customer, dan admin. Yang membedakan JUALIN OS adalah lapisan agen otonom di antara mereka, yaitu sebuah Orchestrator yang merutekan setiap peristiwa seperti chat masuk, pembayaran, perubahan stok, dan jadwal terjadwal ke agen spesialis yang tepat, lalu mencatat tindakannya untuk diaudit dan, bila berisiko, dimintakan persetujuan penjual.</w:t>
       </w:r>
     </w:p>
     <w:tbl>
@@ -2137,7 +2272,7 @@
       <w:tr>
         <w:tc>
           <w:tcPr>
-            <w:tcW w:type="dxa" w:w="1814"/>
+            <w:tcW w:type="dxa" w:w="1928"/>
             <w:vAlign w:val="center"/>
             <w:shd w:fill="16A34A"/>
           </w:tcPr>
@@ -2153,13 +2288,13 @@
                 <w:color w:val="FFFFFF"/>
                 <w:sz w:val="21"/>
               </w:rPr>
-              <w:t>Kategori</w:t>
+              <w:t>Agen (peran)</w:t>
             </w:r>
           </w:p>
         </w:tc>
         <w:tc>
           <w:tcPr>
-            <w:tcW w:type="dxa" w:w="5669"/>
+            <w:tcW w:type="dxa" w:w="5556"/>
             <w:vAlign w:val="center"/>
             <w:shd w:fill="16A34A"/>
           </w:tcPr>
@@ -2175,7 +2310,7 @@
                 <w:color w:val="FFFFFF"/>
                 <w:sz w:val="21"/>
               </w:rPr>
-              <w:t>Kebutuhan</w:t>
+              <w:t>Tanggung jawab otonom</w:t>
             </w:r>
           </w:p>
         </w:tc>
@@ -2183,7 +2318,7 @@
       <w:tr>
         <w:tc>
           <w:tcPr>
-            <w:tcW w:type="dxa" w:w="1814"/>
+            <w:tcW w:type="dxa" w:w="1928"/>
             <w:vAlign w:val="center"/>
           </w:tcPr>
           <w:p>
@@ -2197,13 +2332,13 @@
                 <w:b w:val="0"/>
                 <w:sz w:val="21"/>
               </w:rPr>
-              <w:t>Fungsional seller</w:t>
+              <w:t>Orchestrator (Manajer)</w:t>
             </w:r>
           </w:p>
         </w:tc>
         <w:tc>
           <w:tcPr>
-            <w:tcW w:type="dxa" w:w="5669"/>
+            <w:tcW w:type="dxa" w:w="5556"/>
             <w:vAlign w:val="center"/>
           </w:tcPr>
           <w:p>
@@ -2217,7 +2352,7 @@
                 <w:b w:val="0"/>
                 <w:sz w:val="21"/>
               </w:rPr>
-              <w:t>Registrasi/login, CRUD produk, upload gambar, AI enrich produk, dashboard analytics, order management, inbox/manual takeover, campaign draft, template niche, onboarding, storefront, billing/quota.</w:t>
+              <w:t>Merutekan peristiwa ke agen, menjaga kebijakan global, dan menyusun Laporan Harian.</w:t>
             </w:r>
           </w:p>
         </w:tc>
@@ -2225,7 +2360,7 @@
       <w:tr>
         <w:tc>
           <w:tcPr>
-            <w:tcW w:type="dxa" w:w="1814"/>
+            <w:tcW w:type="dxa" w:w="1928"/>
             <w:vAlign w:val="center"/>
             <w:shd w:fill="F8FAFC"/>
           </w:tcPr>
@@ -2240,13 +2375,13 @@
                 <w:b w:val="0"/>
                 <w:sz w:val="21"/>
               </w:rPr>
-              <w:t>Fungsional customer</w:t>
+              <w:t>Sales (Pramuniaga)</w:t>
             </w:r>
           </w:p>
         </w:tc>
         <w:tc>
           <w:tcPr>
-            <w:tcW w:type="dxa" w:w="5669"/>
+            <w:tcW w:type="dxa" w:w="5556"/>
             <w:vAlign w:val="center"/>
             <w:shd w:fill="F8FAFC"/>
           </w:tcPr>
@@ -2261,7 +2396,7 @@
                 <w:b w:val="0"/>
                 <w:sz w:val="21"/>
               </w:rPr>
-              <w:t>Chat publik toko, riwayat sesi, rekomendasi produk, konfirmasi order, link pembayaran, dan halaman status pembayaran.</w:t>
+              <w:t>Melayani percakapan berbasis katalog: menyapa, menggali kebutuhan, presentasi, dan closing.</w:t>
             </w:r>
           </w:p>
         </w:tc>
@@ -2269,7 +2404,7 @@
       <w:tr>
         <w:tc>
           <w:tcPr>
-            <w:tcW w:type="dxa" w:w="1814"/>
+            <w:tcW w:type="dxa" w:w="1928"/>
             <w:vAlign w:val="center"/>
           </w:tcPr>
           <w:p>
@@ -2283,13 +2418,13 @@
                 <w:b w:val="0"/>
                 <w:sz w:val="21"/>
               </w:rPr>
-              <w:t>Fungsional admin</w:t>
+              <w:t>Negotiator (Juru Tawar)</w:t>
             </w:r>
           </w:p>
         </w:tc>
         <w:tc>
           <w:tcPr>
-            <w:tcW w:type="dxa" w:w="5669"/>
+            <w:tcW w:type="dxa" w:w="5556"/>
             <w:vAlign w:val="center"/>
           </w:tcPr>
           <w:p>
@@ -2303,7 +2438,7 @@
                 <w:b w:val="0"/>
                 <w:sz w:val="21"/>
               </w:rPr>
-              <w:t>Monitoring sistem, provider health, failed jobs, audit logs, seller management, concierge setup, dan retry/replay webhook.</w:t>
+              <w:t>Menanggapi tawar-menawar dengan penawaran yang dijamin tidak pernah di bawah lantai margin.</w:t>
             </w:r>
           </w:p>
         </w:tc>
@@ -2311,7 +2446,7 @@
       <w:tr>
         <w:tc>
           <w:tcPr>
-            <w:tcW w:type="dxa" w:w="1814"/>
+            <w:tcW w:type="dxa" w:w="1928"/>
             <w:vAlign w:val="center"/>
             <w:shd w:fill="F8FAFC"/>
           </w:tcPr>
@@ -2326,13 +2461,13 @@
                 <w:b w:val="0"/>
                 <w:sz w:val="21"/>
               </w:rPr>
-              <w:t>AI</w:t>
+              <w:t>Inventory (Gudang)</w:t>
             </w:r>
           </w:p>
         </w:tc>
         <w:tc>
           <w:tcPr>
-            <w:tcW w:type="dxa" w:w="5669"/>
+            <w:tcW w:type="dxa" w:w="5556"/>
             <w:vAlign w:val="center"/>
             <w:shd w:fill="F8FAFC"/>
           </w:tcPr>
@@ -2347,7 +2482,7 @@
                 <w:b w:val="0"/>
                 <w:sz w:val="21"/>
               </w:rPr>
-              <w:t>Intent detection, sales stage, semantic product search, structured action, guardrails anti-halusinasi, trace, feedback, eval case, dan QA review.</w:t>
+              <w:t>Memverifikasi stok sebelum janji atau order, dan mendeteksi stok menipis.</w:t>
             </w:r>
           </w:p>
         </w:tc>
@@ -2355,7 +2490,7 @@
       <w:tr>
         <w:tc>
           <w:tcPr>
-            <w:tcW w:type="dxa" w:w="1814"/>
+            <w:tcW w:type="dxa" w:w="1928"/>
             <w:vAlign w:val="center"/>
           </w:tcPr>
           <w:p>
@@ -2369,13 +2504,13 @@
                 <w:b w:val="0"/>
                 <w:sz w:val="21"/>
               </w:rPr>
-              <w:t>Non-fungsional</w:t>
+              <w:t>Growth (Marketing)</w:t>
             </w:r>
           </w:p>
         </w:tc>
         <w:tc>
           <w:tcPr>
-            <w:tcW w:type="dxa" w:w="5669"/>
+            <w:tcW w:type="dxa" w:w="5556"/>
             <w:vAlign w:val="center"/>
           </w:tcPr>
           <w:p>
@@ -2389,7 +2524,51 @@
                 <w:b w:val="0"/>
                 <w:sz w:val="21"/>
               </w:rPr>
-              <w:t>Aman, tenant-isolated, cepat, mobile-first, dapat diaudit, dapat dideploy murah, dan mudah dipelihara.</w:t>
+              <w:t>Menagih pembayaran tertunda dan menyapa kembali pelanggan pasif secara proaktif.</w:t>
+            </w:r>
+          </w:p>
+        </w:tc>
+      </w:tr>
+      <w:tr>
+        <w:tc>
+          <w:tcPr>
+            <w:tcW w:type="dxa" w:w="1928"/>
+            <w:vAlign w:val="center"/>
+            <w:shd w:fill="F8FAFC"/>
+          </w:tcPr>
+          <w:p>
+            <w:pPr>
+              <w:spacing w:after="0" w:line="276" w:lineRule="auto"/>
+            </w:pPr>
+            <w:r/>
+            <w:r>
+              <w:rPr>
+                <w:rFonts w:ascii="Times New Roman" w:hAnsi="Times New Roman"/>
+                <w:b w:val="0"/>
+                <w:sz w:val="21"/>
+              </w:rPr>
+              <w:t>Finance (Keuangan)</w:t>
+            </w:r>
+          </w:p>
+        </w:tc>
+        <w:tc>
+          <w:tcPr>
+            <w:tcW w:type="dxa" w:w="5556"/>
+            <w:vAlign w:val="center"/>
+            <w:shd w:fill="F8FAFC"/>
+          </w:tcPr>
+          <w:p>
+            <w:pPr>
+              <w:spacing w:after="0" w:line="276" w:lineRule="auto"/>
+            </w:pPr>
+            <w:r/>
+            <w:r>
+              <w:rPr>
+                <w:rFonts w:ascii="Times New Roman" w:hAnsi="Times New Roman"/>
+                <w:b w:val="0"/>
+                <w:sz w:val="21"/>
+              </w:rPr>
+              <w:t>Merekap omzet, pembayaran lunas dibandingkan tertunda, dan produk terlaris.</w:t>
             </w:r>
           </w:p>
         </w:tc>
@@ -2446,7 +2625,7 @@
           <w:i/>
           <w:sz w:val="20"/>
         </w:rPr>
-        <w:t>Gambar 1. Arsitektur sistem JUALIN.AI.</w:t>
+        <w:t>Gambar 1. Arsitektur multi-agen JUALIN OS.</w:t>
       </w:r>
     </w:p>
     <w:p>
@@ -2512,7 +2691,7 @@
           <w:rFonts w:ascii="Times New Roman" w:hAnsi="Times New Roman"/>
           <w:sz w:val="24"/>
         </w:rPr>
-        <w:t>Desain solusi menempatkan katalog sebagai sumber kebenaran utama. Setiap respons AI dibangun dari konteks produk seller, semantic search, histori percakapan terbatas, dan kebijakan untrusted data. Pendekatan ini mengurangi risiko AI menjawab di luar data toko dan membuat alur penjualan lebih dapat diaudit.</w:t>
+        <w:t>Kebaruan teknis terpenting adalah pemisahan angka dari kata pada negosiasi. Sebuah penghasil penawaran yang deterministik menghitung tawaran balik memakai tangga konsesi yang dibatasi lantai harga, yaitu nilai terbesar antara modal dikali satu tambah margin minimum dan harga dikali satu kurang diskon maksimum. Model bahasa hanya merangkai kalimat di sekitar angka yang sudah diputuskan mesin, sehingga AI tidak mungkin mengarang harga atau menjual rugi. Pendekatan ini sejalan dengan temuan riset bargaining model bahasa bahwa agen membutuhkan penghasil penawaran untuk mengontrol rentang harga.</w:t>
       </w:r>
     </w:p>
     <w:tbl>
@@ -2589,7 +2768,7 @@
                 <w:b w:val="0"/>
                 <w:sz w:val="21"/>
               </w:rPr>
-              <w:t>Katalog cerdas</w:t>
+              <w:t>Mesin negosiasi</w:t>
             </w:r>
           </w:p>
         </w:tc>
@@ -2609,7 +2788,7 @@
                 <w:b w:val="0"/>
                 <w:sz w:val="21"/>
               </w:rPr>
-              <w:t>Produk memiliki nama, deskripsi, harga, stok, kategori, foto, summary, dan embedding 384 dimensi untuk semantic search.</w:t>
+              <w:t>Mesin deterministik menjaga lantai margin; model bahasa hanya untuk bahasa; diskon di atas ambang masuk antrean persetujuan.</w:t>
             </w:r>
           </w:p>
         </w:tc>
@@ -2632,7 +2811,7 @@
                 <w:b w:val="0"/>
                 <w:sz w:val="21"/>
               </w:rPr>
-              <w:t>AI chat</w:t>
+              <w:t>Memori dan state</w:t>
             </w:r>
           </w:p>
         </w:tc>
@@ -2653,7 +2832,7 @@
                 <w:b w:val="0"/>
                 <w:sz w:val="21"/>
               </w:rPr>
-              <w:t>Agent mendeteksi intent, sales stage, produk relevan, lalu membuat respons singkat berbahasa Indonesia.</w:t>
+              <w:t>Memori customer berbasis pgvector untuk personalisasi; negotiation_states menyimpan konteks tawar yang sedang berjalan.</w:t>
             </w:r>
           </w:p>
         </w:tc>
@@ -2675,7 +2854,7 @@
                 <w:b w:val="0"/>
                 <w:sz w:val="21"/>
               </w:rPr>
-              <w:t>Order</w:t>
+              <w:t>Substrat peristiwa</w:t>
             </w:r>
           </w:p>
         </w:tc>
@@ -2695,7 +2874,7 @@
                 <w:b w:val="0"/>
                 <w:sz w:val="21"/>
               </w:rPr>
-              <w:t>Order dibuat hanya setelah detail customer dan produk dapat dicocokkan dengan data seller.</w:t>
+              <w:t>background_jobs dan worker arq untuk kerja proaktif; audit_logs dan agent_runs untuk jejak yang dapat diaudit.</w:t>
             </w:r>
           </w:p>
         </w:tc>
@@ -2718,7 +2897,7 @@
                 <w:b w:val="0"/>
                 <w:sz w:val="21"/>
               </w:rPr>
-              <w:t>Payment</w:t>
+              <w:t>Kendali manusia</w:t>
             </w:r>
           </w:p>
         </w:tc>
@@ -2739,7 +2918,7 @@
                 <w:b w:val="0"/>
                 <w:sz w:val="21"/>
               </w:rPr>
-              <w:t>Payment link dan webhook disiapkan untuk Midtrans/Cashi; status dapat dipantau customer dan seller.</w:t>
+              <w:t>agent_policies sebagai sakelar per agen dan ambang diskon; agent_approvals sebagai antrean human-in-the-loop.</w:t>
             </w:r>
           </w:p>
         </w:tc>
@@ -2761,7 +2940,7 @@
                 <w:b w:val="0"/>
                 <w:sz w:val="21"/>
               </w:rPr>
-              <w:t>Trust layer</w:t>
+              <w:t>Ketahanan</w:t>
             </w:r>
           </w:p>
         </w:tc>
@@ -2781,7 +2960,7 @@
                 <w:b w:val="0"/>
                 <w:sz w:val="21"/>
               </w:rPr>
-              <w:t>Kebijakan refund, shipping, support hours, dan verified payment ditampilkan di storefront/public trust profile.</w:t>
+              <w:t>Setiap pemanggilan agen dibungkus savepoint transaksi sehingga kegagalan agen tidak menjatuhkan chat utama.</w:t>
             </w:r>
           </w:p>
         </w:tc>
@@ -2825,7 +3004,7 @@
                 <w:b w:val="0"/>
                 <w:sz w:val="21"/>
               </w:rPr>
-              <w:t>AI trace, eval run, feedback, usage event, audit log, dan provider health digunakan untuk pengawasan.</w:t>
+              <w:t>AI trace, usage event, dan provider health untuk pengawasan operasional.</w:t>
             </w:r>
           </w:p>
         </w:tc>
@@ -2851,7 +3030,7 @@
           <w:rFonts w:ascii="Times New Roman" w:hAnsi="Times New Roman"/>
           <w:sz w:val="24"/>
         </w:rPr>
-        <w:t>Implementasi JUALIN.AI sudah berbentuk aplikasi web full-stack. Struktur repository menunjukkan backend, frontend, nginx, Docker Compose, migration Alembic, seed data, test backend, serta rencana hardening keamanan dan market acceptance. Berdasarkan inspeksi repository, prototipe memuat sekitar 171 endpoint API, 75 model basis data, 36 halaman frontend, dan 12 test backend.</w:t>
+        <w:t>Implementasi JUALIN OS berbentuk aplikasi web full-stack yang dapat dijalankan, dibangun secara bertahap di atas basis kode JUALIN.AI. Lapisan multi-agen ditambahkan melalui modul models agent_os dengan empat tabel yaitu AgentPolicy, AgentRun, AgentApproval, dan NegotiationState, paket services agent_os yang berisi orchestrator, negotiation, inventory, finance, growth, brief, dan cycles, API agent-os, worker terjadwal, serta halaman dashboard AI Crew. Seluruh fitur baru dikendalikan feature flag sehingga aman terhadap perilaku lama.</w:t>
       </w:r>
     </w:p>
     <w:tbl>
@@ -2971,7 +3150,7 @@
                 <w:b w:val="0"/>
                 <w:sz w:val="21"/>
               </w:rPr>
-              <w:t>Next.js 16, React 19, CSS Modules</w:t>
+              <w:t>Next.js 16, React, CSS Modules</w:t>
             </w:r>
           </w:p>
         </w:tc>
@@ -2991,7 +3170,7 @@
                 <w:b w:val="0"/>
                 <w:sz w:val="21"/>
               </w:rPr>
-              <w:t>Cepat untuk dashboard dan public chat, mendukung routing modern dan UI mobile-first.</w:t>
+              <w:t>Cepat untuk dashboard dan chat publik, mendukung UI mobile-first.</w:t>
             </w:r>
           </w:p>
         </w:tc>
@@ -3035,7 +3214,7 @@
                 <w:b w:val="0"/>
                 <w:sz w:val="21"/>
               </w:rPr>
-              <w:t>FastAPI, Pydantic, SQLAlchemy</w:t>
+              <w:t>FastAPI, Pydantic, SQLAlchemy async</w:t>
             </w:r>
           </w:p>
         </w:tc>
@@ -3056,7 +3235,7 @@
                 <w:b w:val="0"/>
                 <w:sz w:val="21"/>
               </w:rPr>
-              <w:t>Ringan, cocok untuk API modular, validasi request jelas, dan dokumentasi endpoint mudah.</w:t>
+              <w:t>Ringan, cocok untuk API modular dan orkestrasi agen, validasi request jelas.</w:t>
             </w:r>
           </w:p>
         </w:tc>
@@ -3118,7 +3297,7 @@
                 <w:b w:val="0"/>
                 <w:sz w:val="21"/>
               </w:rPr>
-              <w:t>Data relasional tetap kuat, sementara pencarian semantik katalog dapat dilakukan di database yang sama.</w:t>
+              <w:t>Data relasional kuat, sementara pencarian semantik katalog dilakukan pada basis data yang sama.</w:t>
             </w:r>
           </w:p>
         </w:tc>
@@ -3141,7 +3320,7 @@
                 <w:b w:val="0"/>
                 <w:sz w:val="21"/>
               </w:rPr>
-              <w:t>Cache/queue</w:t>
+              <w:t>Cache dan worker</w:t>
             </w:r>
           </w:p>
         </w:tc>
@@ -3162,7 +3341,7 @@
                 <w:b w:val="0"/>
                 <w:sz w:val="21"/>
               </w:rPr>
-              <w:t>Redis 7</w:t>
+              <w:t>Redis 7 dan arq</w:t>
             </w:r>
           </w:p>
         </w:tc>
@@ -3183,7 +3362,7 @@
                 <w:b w:val="0"/>
                 <w:sz w:val="21"/>
               </w:rPr>
-              <w:t>Digunakan untuk rate limit, cache katalog, dan job ringan agar VPS tetap hemat.</w:t>
+              <w:t>Rate limit, cache katalog, dan kerja proaktif agen yang terjadwal dan hemat.</w:t>
             </w:r>
           </w:p>
         </w:tc>
@@ -3225,7 +3404,7 @@
                 <w:b w:val="0"/>
                 <w:sz w:val="21"/>
               </w:rPr>
-              <w:t>LLM via OpenAI-compatible endpoint, embedding all-MiniLM-L6-v2, guardrails</w:t>
+              <w:t>Model bahasa via endpoint OpenAI-compatible, embedding all-MiniLM-L6-v2, guardrails dan mesin deterministik</w:t>
             </w:r>
           </w:p>
         </w:tc>
@@ -3245,7 +3424,7 @@
                 <w:b w:val="0"/>
                 <w:sz w:val="21"/>
               </w:rPr>
-              <w:t>Mendukung respons natural, semantic search, fallback aman, dan pengembangan murah.</w:t>
+              <w:t>Respons natural dengan angka harga dikontrol mesin, biaya pengembangan rendah.</w:t>
             </w:r>
           </w:p>
         </w:tc>
@@ -3310,7 +3489,7 @@
                 <w:b w:val="0"/>
                 <w:sz w:val="21"/>
               </w:rPr>
-              <w:t>Mudah direplikasi pada VPS kecil dan siap dipindahkan ke server production.</w:t>
+              <w:t>Mudah direplikasi pada VPS dengan pengujian otomatis sebelum deploy.</w:t>
             </w:r>
           </w:p>
         </w:tc>
@@ -3327,7 +3506,7 @@
           <w:rFonts w:ascii="Times New Roman" w:hAnsi="Times New Roman"/>
           <w:sz w:val="24"/>
         </w:rPr>
-        <w:t>Fitur yang sudah tercermin di codebase meliputi autentikasi JWT, product CRUD, upload gambar aman, AI chat, streaming chat, order, payment, analytics, inbox, campaigns, workflows, billing, templates, onboarding, storefront, trust profile, growth links, WhatsApp templates, referrals, lead forms, AI playbooks, knowledge base, QA review, experiments, dan admin system dashboard.</w:t>
+        <w:t>Selain modul agen, basis kode mencerminkan fitur autentikasi JWT, CRUD produk, chat AI dan streaming, order, payment, analytics, inbox, campaigns, workflows, billing, storefront, trust profile, growth links, referrals, knowledge base, QA review, experiments, serta admin dashboard. Lapisan JUALIN OS menyatukannya menjadi operasi toko yang otonom dan terkendali.</w:t>
       </w:r>
     </w:p>
     <w:p>
@@ -3340,7 +3519,7 @@
           <w:rFonts w:ascii="Times New Roman" w:hAnsi="Times New Roman"/>
           <w:sz w:val="24"/>
         </w:rPr>
-        <w:t>Keamanan: production security validation, rate limiting, CORS control, request logging, JWT claims, upload image sanitization, webhook signature validation, open redirect protection, dan seller_id filtering pada route penting.</w:t>
+        <w:t>Keamanan: validasi keamanan produksi, rate limiting, CORS, request logging, JWT, sanitasi upload gambar, validasi signature webhook, dan filter seller_id pada route penting.</w:t>
       </w:r>
     </w:p>
     <w:p>
@@ -3353,7 +3532,7 @@
           <w:rFonts w:ascii="Times New Roman" w:hAnsi="Times New Roman"/>
           <w:sz w:val="24"/>
         </w:rPr>
-        <w:t>Kualitas AI: tujuh guardrail utama, untrusted data policy, intent detection, sales stage detection, structured AI action, fallback response, dan trace untuk evaluasi.</w:t>
+        <w:t>Kualitas dan keamanan AI: tujuh guardrail, kebijakan untrusted data anti prompt-injection, mesin negosiasi deterministik aman-margin, dan trace untuk evaluasi.</w:t>
       </w:r>
     </w:p>
     <w:p>
@@ -3366,7 +3545,7 @@
           <w:rFonts w:ascii="Times New Roman" w:hAnsi="Times New Roman"/>
           <w:sz w:val="24"/>
         </w:rPr>
-        <w:t>Keandalan: penggunaan idempotency key, background job, retry/replay admin, usage event ledger, dan health/readiness endpoint.</w:t>
+        <w:t>Keandalan: idempotency key, background job dengan retry, savepoint transaksi pada lapisan agen, dan endpoint health serta readiness.</w:t>
       </w:r>
     </w:p>
     <w:p>
@@ -3379,7 +3558,7 @@
           <w:rFonts w:ascii="Times New Roman" w:hAnsi="Times New Roman"/>
           <w:sz w:val="24"/>
         </w:rPr>
-        <w:t>Skalabilitas awal: deployment dirancang untuk VPS 4GB dengan Redis maxmemory dan worker concurrency terbatas.</w:t>
+        <w:t>Tata kelola otonomi: agent_policies untuk kebijakan per penjual, agent_approvals untuk persetujuan manusia, dan agent_runs untuk activity feed yang dapat diaudit.</w:t>
       </w:r>
     </w:p>
     <w:tbl>
@@ -3456,7 +3635,7 @@
                 <w:b w:val="0"/>
                 <w:sz w:val="21"/>
               </w:rPr>
-              <w:t>python -m compileall backend</w:t>
+              <w:t>compileall backend</w:t>
             </w:r>
           </w:p>
         </w:tc>
@@ -3476,7 +3655,7 @@
                 <w:b w:val="0"/>
                 <w:sz w:val="21"/>
               </w:rPr>
-              <w:t>Berhasil; semua file Python backend dapat dikompilasi sintaksis.</w:t>
+              <w:t>Berhasil; seluruh modul backend termasuk services agent_os lolos kompilasi.</w:t>
             </w:r>
           </w:p>
         </w:tc>
@@ -3499,7 +3678,7 @@
                 <w:b w:val="0"/>
                 <w:sz w:val="21"/>
               </w:rPr>
-              <w:t>docker compose config --quiet</w:t>
+              <w:t>Validasi mesin negosiasi</w:t>
             </w:r>
           </w:p>
         </w:tc>
@@ -3520,7 +3699,7 @@
                 <w:b w:val="0"/>
                 <w:sz w:val="21"/>
               </w:rPr>
-              <w:t>Berhasil; konfigurasi compose valid secara struktur.</w:t>
+              <w:t>Nol pelanggaran lantai margin pada seluruh skenario dan ronde uji.</w:t>
             </w:r>
           </w:p>
         </w:tc>
@@ -3542,7 +3721,7 @@
                 <w:b w:val="0"/>
                 <w:sz w:val="21"/>
               </w:rPr>
-              <w:t>pytest backend/tests</w:t>
+              <w:t>CI GitHub Actions</w:t>
             </w:r>
           </w:p>
         </w:tc>
@@ -3562,7 +3741,7 @@
                 <w:b w:val="0"/>
                 <w:sz w:val="21"/>
               </w:rPr>
-              <w:t>Belum dijalankan di runtime ini karena modul pytest tidak tersedia; test suite tetap tersedia di repository.</w:t>
+              <w:t>Dikonfigurasi menjalankan pytest, audit dependensi, lint, dan build frontend pada setiap perubahan.</w:t>
             </w:r>
           </w:p>
         </w:tc>
@@ -3588,7 +3767,7 @@
           <w:rFonts w:ascii="Times New Roman" w:hAnsi="Times New Roman"/>
           <w:sz w:val="24"/>
         </w:rPr>
-        <w:t>Mockup berikut disiapkan untuk menunjukkan pengalaman utama produk. Interface sengaja dibuat familiar untuk UMKM: chat seperti aplikasi percakapan, dashboard fokus pada uang/order, dan onboarding dibuat singkat agar seller tidak tersesat pada konfigurasi teknis.</w:t>
+        <w:t>Antarmuka dirancang familiar untuk UMKM sekaligus menampilkan kendali atas tim agen. Customer berinteraksi melalui chat seperti aplikasi percakapan, termasuk saat tawar-menawar yang dijawab agen Juru Tawar secara aman-margin. Penjual memantau melalui dashboard yang fokus pada uang dan order, sementara Pusat Komando AI Crew menampilkan status tiap agen, activity feed, antrean persetujuan, dan laporan harian sehingga penjual selalu tahu apa yang dilakukan AI.</w:t>
       </w:r>
     </w:p>
     <w:p>
@@ -3641,7 +3820,7 @@
           <w:i/>
           <w:sz w:val="20"/>
         </w:rPr>
-        <w:t>Gambar 3. Mockup halaman chat customer.</w:t>
+        <w:t>Gambar 3. Mockup halaman chat customer dengan layanan agen.</w:t>
       </w:r>
     </w:p>
     <w:p>
@@ -3694,7 +3873,7 @@
           <w:i/>
           <w:sz w:val="20"/>
         </w:rPr>
-        <w:t>Gambar 4. Mockup seller dashboard.</w:t>
+        <w:t>Gambar 4. Mockup dashboard penjual.</w:t>
       </w:r>
     </w:p>
     <w:p>
@@ -3747,7 +3926,7 @@
           <w:i/>
           <w:sz w:val="20"/>
         </w:rPr>
-        <w:t>Gambar 5. Mockup quick start onboarding.</w:t>
+        <w:t>Gambar 5. Mockup quick start onboarding penjual.</w:t>
       </w:r>
     </w:p>
     <w:p/>
@@ -3769,7 +3948,7 @@
           <w:rFonts w:ascii="Times New Roman" w:hAnsi="Times New Roman"/>
           <w:sz w:val="24"/>
         </w:rPr>
-        <w:t>Cara penggunaan dibagi menjadi dua alur: alur seller sebagai pemilik toko dan alur customer sebagai pembeli. Dokumentasi ini juga dapat dipakai sebagai dasar video demo maksimal tiga menit pada tahap lanjutan.</w:t>
+        <w:t>Penggunaan dibagi menjadi dua alur, yaitu penjual sebagai pemilik toko dan customer sebagai pembeli. Dokumentasi ini juga menjadi dasar video demo maksimal tiga menit pada babak final.</w:t>
       </w:r>
     </w:p>
     <w:tbl>
@@ -3846,7 +4025,7 @@
                 <w:b w:val="0"/>
                 <w:sz w:val="21"/>
               </w:rPr>
-              <w:t>1. Registrasi</w:t>
+              <w:t>1. Registrasi dan setup</w:t>
             </w:r>
           </w:p>
         </w:tc>
@@ -3866,7 +4045,7 @@
                 <w:b w:val="0"/>
                 <w:sz w:val="21"/>
               </w:rPr>
-              <w:t>Seller membuat akun, mengisi nama toko, nomor kontak, slug toko, dan memilih gaya AI.</w:t>
+              <w:t>Penjual membuat akun toko, mengisi katalog dan modal produk untuk batas margin, lalu memilih gaya AI.</w:t>
             </w:r>
           </w:p>
         </w:tc>
@@ -3889,7 +4068,7 @@
                 <w:b w:val="0"/>
                 <w:sz w:val="21"/>
               </w:rPr>
-              <w:t>2. Quick start</w:t>
+              <w:t>2. Atur kebijakan agen</w:t>
             </w:r>
           </w:p>
         </w:tc>
@@ -3910,7 +4089,7 @@
                 <w:b w:val="0"/>
                 <w:sz w:val="21"/>
               </w:rPr>
-              <w:t>Seller memilih kategori usaha, memasukkan 3-5 produk awal, dan menjalankan simulasi chat.</w:t>
+              <w:t>Penjual menyetel kebijakan di Pusat Komando AI Crew: diskon maksimum, margin minimum, dan ambang persetujuan.</w:t>
             </w:r>
           </w:p>
         </w:tc>
@@ -3932,7 +4111,7 @@
                 <w:b w:val="0"/>
                 <w:sz w:val="21"/>
               </w:rPr>
-              <w:t>3. Kelola katalog</w:t>
+              <w:t>3. Aktifkan AI Crew</w:t>
             </w:r>
           </w:p>
         </w:tc>
@@ -3952,7 +4131,7 @@
                 <w:b w:val="0"/>
                 <w:sz w:val="21"/>
               </w:rPr>
-              <w:t>Seller menambah produk, foto, harga, stok, kategori, dan mengecek catalog score.</w:t>
+              <w:t>Tim agen mulai melayani chat, menawar, menjaga stok, dan menagih secara otonom.</w:t>
             </w:r>
           </w:p>
         </w:tc>
@@ -3975,7 +4154,7 @@
                 <w:b w:val="0"/>
                 <w:sz w:val="21"/>
               </w:rPr>
-              <w:t>4. Bagikan link</w:t>
+              <w:t>4. Pantau activity feed</w:t>
             </w:r>
           </w:p>
         </w:tc>
@@ -3996,7 +4175,7 @@
                 <w:b w:val="0"/>
                 <w:sz w:val="21"/>
               </w:rPr>
-              <w:t>Seller membagikan link chat/storefront ke WhatsApp, Instagram, atau bio sosial media.</w:t>
+              <w:t>Penjual melihat tindakan tiap agen secara langsung beserta alasan keputusan.</w:t>
             </w:r>
           </w:p>
         </w:tc>
@@ -4018,7 +4197,7 @@
                 <w:b w:val="0"/>
                 <w:sz w:val="21"/>
               </w:rPr>
-              <w:t>5. Pantau chat dan order</w:t>
+              <w:t>5. Setujui keputusan berisiko</w:t>
             </w:r>
           </w:p>
         </w:tc>
@@ -4038,7 +4217,7 @@
                 <w:b w:val="0"/>
                 <w:sz w:val="21"/>
               </w:rPr>
-              <w:t>Seller melihat percakapan, mengambil alih manual jika perlu, memproses order, dan mengikuti status pembayaran.</w:t>
+              <w:t>Penjual menyetujui atau menolak diskon besar dan aksi sensitif dari antrean persetujuan.</w:t>
             </w:r>
           </w:p>
         </w:tc>
@@ -4061,7 +4240,7 @@
                 <w:b w:val="0"/>
                 <w:sz w:val="21"/>
               </w:rPr>
-              <w:t>6. Evaluasi</w:t>
+              <w:t>6. Baca Laporan Harian</w:t>
             </w:r>
           </w:p>
         </w:tc>
@@ -4082,7 +4261,7 @@
                 <w:b w:val="0"/>
                 <w:sz w:val="21"/>
               </w:rPr>
-              <w:t>Seller membaca dashboard money metrics, conversion funnel, produk laris, pending payment, dan rekomendasi campaign.</w:t>
+              <w:t>Penjual menerima ringkasan omzet, pembayaran tertunda, stok menipis, dan saran tindakan.</w:t>
             </w:r>
           </w:p>
         </w:tc>
@@ -4206,7 +4385,7 @@
                 <w:b w:val="0"/>
                 <w:sz w:val="21"/>
               </w:rPr>
-              <w:t>2. Tanya produk</w:t>
+              <w:t>2. Tanya dan menawar</w:t>
             </w:r>
           </w:p>
         </w:tc>
@@ -4227,7 +4406,7 @@
                 <w:b w:val="0"/>
                 <w:sz w:val="21"/>
               </w:rPr>
-              <w:t>Customer menanyakan stok, harga, ukuran, rekomendasi, atau cara order.</w:t>
+              <w:t>Customer menanyakan produk atau menawar; agen Juru Tawar menanggapi dengan penawaran aman-margin.</w:t>
             </w:r>
           </w:p>
         </w:tc>
@@ -4249,7 +4428,7 @@
                 <w:b w:val="0"/>
                 <w:sz w:val="21"/>
               </w:rPr>
-              <w:t>3. Terima rekomendasi</w:t>
+              <w:t>3. Konfirmasi order</w:t>
             </w:r>
           </w:p>
         </w:tc>
@@ -4269,7 +4448,7 @@
                 <w:b w:val="0"/>
                 <w:sz w:val="21"/>
               </w:rPr>
-              <w:t>AI menjawab berdasarkan katalog dan menawarkan alternatif jika produk tidak tersedia.</w:t>
+              <w:t>Customer menyetujui detail item, jumlah, dan data pengiriman.</w:t>
             </w:r>
           </w:p>
         </w:tc>
@@ -4292,7 +4471,7 @@
                 <w:b w:val="0"/>
                 <w:sz w:val="21"/>
               </w:rPr>
-              <w:t>4. Konfirmasi order</w:t>
+              <w:t>4. Bayar</w:t>
             </w:r>
           </w:p>
         </w:tc>
@@ -4313,7 +4492,7 @@
                 <w:b w:val="0"/>
                 <w:sz w:val="21"/>
               </w:rPr>
-              <w:t>Customer menyetujui detail item, jumlah, nama, alamat, dan nomor HP.</w:t>
+              <w:t>Customer membuka link pembayaran resmi dan memilih QRIS atau VA bila gateway aktif.</w:t>
             </w:r>
           </w:p>
         </w:tc>
@@ -4335,7 +4514,7 @@
                 <w:b w:val="0"/>
                 <w:sz w:val="21"/>
               </w:rPr>
-              <w:t>5. Bayar</w:t>
+              <w:t>5. Tindak lanjut</w:t>
             </w:r>
           </w:p>
         </w:tc>
@@ -4355,51 +4534,7 @@
                 <w:b w:val="0"/>
                 <w:sz w:val="21"/>
               </w:rPr>
-              <w:t>Customer membuka link pembayaran resmi dan memilih QRIS/VA jika gateway aktif.</w:t>
-            </w:r>
-          </w:p>
-        </w:tc>
-      </w:tr>
-      <w:tr>
-        <w:tc>
-          <w:tcPr>
-            <w:tcW w:type="dxa" w:w="1814"/>
-            <w:vAlign w:val="center"/>
-            <w:shd w:fill="F8FAFC"/>
-          </w:tcPr>
-          <w:p>
-            <w:pPr>
-              <w:spacing w:after="0" w:line="276" w:lineRule="auto"/>
-            </w:pPr>
-            <w:r/>
-            <w:r>
-              <w:rPr>
-                <w:rFonts w:ascii="Times New Roman" w:hAnsi="Times New Roman"/>
-                <w:b w:val="0"/>
-                <w:sz w:val="21"/>
-              </w:rPr>
-              <w:t>6. Follow-up</w:t>
-            </w:r>
-          </w:p>
-        </w:tc>
-        <w:tc>
-          <w:tcPr>
-            <w:tcW w:type="dxa" w:w="5669"/>
-            <w:vAlign w:val="center"/>
-            <w:shd w:fill="F8FAFC"/>
-          </w:tcPr>
-          <w:p>
-            <w:pPr>
-              <w:spacing w:after="0" w:line="276" w:lineRule="auto"/>
-            </w:pPr>
-            <w:r/>
-            <w:r>
-              <w:rPr>
-                <w:rFonts w:ascii="Times New Roman" w:hAnsi="Times New Roman"/>
-                <w:b w:val="0"/>
-                <w:sz w:val="21"/>
-              </w:rPr>
-              <w:t>Jika belum bayar, seller/AI dapat melakukan follow-up sesuai aturan yang diaudit.</w:t>
+              <w:t>Bila belum bayar, agen Marketing menindaklanjuti sesuai aturan yang diaudit.</w:t>
             </w:r>
           </w:p>
         </w:tc>
@@ -4416,7 +4551,7 @@
           <w:rFonts w:ascii="Times New Roman" w:hAnsi="Times New Roman"/>
           <w:sz w:val="24"/>
         </w:rPr>
-        <w:t>Skenario demo yang disarankan: seller login, menambah produk, membuka chat publik, customer menanyakan produk, AI memberi rekomendasi, customer mengonfirmasi order, sistem membuat order/payment link, lalu seller melihat order dan metrik pada dashboard.</w:t>
+        <w:t>Skenario demo yang disarankan: penjual mengatur kebijakan, customer menawar sebuah produk di bawah batas margin, agen Juru Tawar menawar balik pada harga aman, customer setuju, agen Pramuniaga membuat order dan link pembayaran, lalu penjual melihat jejak ketiga agen pada activity feed dan menerima laporan harian.</w:t>
       </w:r>
     </w:p>
     <w:p/>
@@ -4473,7 +4608,7 @@
           <w:rFonts w:ascii="Times New Roman" w:hAnsi="Times New Roman"/>
           <w:sz w:val="24"/>
         </w:rPr>
-        <w:t>[1] Badan Pusat Statistik. (2024). Statistik E-Commerce 2024. Jakarta: BPS. https://www.bps.go.id/</w:t>
+        <w:t>[1] Yao, S., Zhao, J., Yu, D., Du, N., Shafran, I., Narasimhan, K., &amp; Cao, Y. (2023). ReAct: Synergizing Reasoning and Acting in Language Models. International Conference on Learning Representations (ICLR). https://arxiv.org/abs/2210.03629</w:t>
       </w:r>
     </w:p>
     <w:p>
@@ -4486,7 +4621,7 @@
           <w:rFonts w:ascii="Times New Roman" w:hAnsi="Times New Roman"/>
           <w:sz w:val="24"/>
         </w:rPr>
-        <w:t>[2] Bank Indonesia. (2025). Kanal edukasi dan publikasi QRIS Bank Indonesia. https://www.bi.go.id/QRIS/default.aspx</w:t>
+        <w:t>[2] Shinn, N., Cassano, F., Gopinath, A., Narasimhan, K., &amp; Yao, S. (2023). Reflexion: Language Agents with Verbal Reinforcement Learning. Advances in Neural Information Processing Systems (NeurIPS). https://arxiv.org/abs/2303.11366</w:t>
       </w:r>
     </w:p>
     <w:p>
@@ -4499,7 +4634,7 @@
           <w:rFonts w:ascii="Times New Roman" w:hAnsi="Times New Roman"/>
           <w:sz w:val="24"/>
         </w:rPr>
-        <w:t>[3] Google, Temasek, &amp; Bain &amp; Company. (2025). e-Conomy SEA 2025. https://economysea.withgoogle.com/</w:t>
+        <w:t>[3] Xia, T., Yu, B., Dang, K., et al. (2024). Measuring Bargaining Abilities of Large Language Models: A Benchmark and a Buyer-Enhancement Method. Findings of the Association for Computational Linguistics (ACL). https://arxiv.org/abs/2402.15813</w:t>
       </w:r>
     </w:p>
     <w:p>
@@ -4512,7 +4647,7 @@
           <w:rFonts w:ascii="Times New Roman" w:hAnsi="Times New Roman"/>
           <w:sz w:val="24"/>
         </w:rPr>
-        <w:t>[4] Kadin Indonesia. (2024). Data dan statistik UMKM Indonesia. https://kadin.id/data-dan-statistik/umkm-indonesia/</w:t>
+        <w:t>[4] Bianchi, F., Chia, P. J., Yuksekgonul, M., et al. (2024). How Well Can LLMs Negotiate? NegotiationArena Platform and Analysis. https://arxiv.org/abs/2402.05863</w:t>
       </w:r>
     </w:p>
     <w:p>
@@ -4525,7 +4660,7 @@
           <w:rFonts w:ascii="Times New Roman" w:hAnsi="Times New Roman"/>
           <w:sz w:val="24"/>
         </w:rPr>
-        <w:t>[5] Lewis, P., Perez, E., Piktus, A., et al. (2020). Retrieval-Augmented Generation for Knowledge-Intensive NLP Tasks. NeurIPS. https://arxiv.org/abs/2005.11401</w:t>
+        <w:t>[5] Wang, L., Ma, C., Feng, X., et al. (2024). A Survey on Large Language Model based Autonomous Agents. Frontiers of Computer Science, 18(6). https://doi.org/10.1007/s11704-024-40231-1</w:t>
       </w:r>
     </w:p>
     <w:p>
@@ -4538,7 +4673,7 @@
           <w:rFonts w:ascii="Times New Roman" w:hAnsi="Times New Roman"/>
           <w:sz w:val="24"/>
         </w:rPr>
-        <w:t>[6] NIST. (2023). Artificial Intelligence Risk Management Framework (AI RMF 1.0). https://www.nist.gov/itl/ai-risk-management-framework</w:t>
+        <w:t>[6] Lewis, P., Perez, E., Piktus, A., et al. (2020). Retrieval-Augmented Generation for Knowledge-Intensive NLP Tasks. NeurIPS. https://arxiv.org/abs/2005.11401</w:t>
       </w:r>
     </w:p>
     <w:p>
@@ -4551,7 +4686,7 @@
           <w:rFonts w:ascii="Times New Roman" w:hAnsi="Times New Roman"/>
           <w:sz w:val="24"/>
         </w:rPr>
-        <w:t>[7] OWASP Foundation. (2023). OWASP API Security Top 10. https://owasp.org/API-Security/editions/2023/en/0x00-header/</w:t>
+        <w:t>[7] Badan Pusat Statistik. (2024). Statistik E-Commerce 2024. Jakarta: BPS. https://www.bps.go.id/</w:t>
       </w:r>
     </w:p>
     <w:p>
@@ -4564,7 +4699,7 @@
           <w:rFonts w:ascii="Times New Roman" w:hAnsi="Times New Roman"/>
           <w:sz w:val="24"/>
         </w:rPr>
-        <w:t>[8] International Organization for Standardization. (2023). ISO/IEC 25010 software quality model. https://www.iso.org/standard/78176.html</w:t>
+        <w:t>[8] Google, Temasek, &amp; Bain &amp; Company. (2024). e-Conomy SEA 2024. https://economysea.withgoogle.com/</w:t>
       </w:r>
     </w:p>
     <w:p>
@@ -4577,7 +4712,7 @@
           <w:rFonts w:ascii="Times New Roman" w:hAnsi="Times New Roman"/>
           <w:sz w:val="24"/>
         </w:rPr>
-        <w:t>[9] PostgreSQL Global Development Group. (2023). PostgreSQL 16 Documentation. https://www.postgresql.org/docs/16/</w:t>
+        <w:t>[9] Kementerian Koperasi dan UKM Republik Indonesia. (2023). Perkembangan Data Usaha Mikro, Kecil, dan Menengah. https://kemenkopukm.go.id/</w:t>
       </w:r>
     </w:p>
     <w:p>
@@ -4590,7 +4725,7 @@
           <w:rFonts w:ascii="Times New Roman" w:hAnsi="Times New Roman"/>
           <w:sz w:val="24"/>
         </w:rPr>
-        <w:t>[10] pgvector Contributors. (2024). pgvector: Open-source vector similarity search for PostgreSQL. https://github.com/pgvector/pgvector</w:t>
+        <w:t>[10] Bank Indonesia. (2024). Laporan Perkembangan Ekonomi dan Keuangan Digital serta QRIS. https://www.bi.go.id/</w:t>
       </w:r>
     </w:p>
     <w:p>
@@ -4603,7 +4738,7 @@
           <w:rFonts w:ascii="Times New Roman" w:hAnsi="Times New Roman"/>
           <w:sz w:val="24"/>
         </w:rPr>
-        <w:t>[11] FastAPI. (2024). FastAPI Documentation. https://fastapi.tiangolo.com/</w:t>
+        <w:t>[11] NIST. (2023). Artificial Intelligence Risk Management Framework (AI RMF 1.0). https://www.nist.gov/itl/ai-risk-management-framework</w:t>
       </w:r>
     </w:p>
     <w:p>
@@ -4616,7 +4751,20 @@
           <w:rFonts w:ascii="Times New Roman" w:hAnsi="Times New Roman"/>
           <w:sz w:val="24"/>
         </w:rPr>
-        <w:t>[12] Vercel. (2024). Next.js App Router Documentation. https://nextjs.org/docs/app</w:t>
+        <w:t>[12] International Organization for Standardization. (2023). ISO/IEC 25010 software quality model. https://www.iso.org/standard/78176.html</w:t>
+      </w:r>
+    </w:p>
+    <w:p>
+      <w:pPr>
+        <w:spacing w:line="360" w:lineRule="auto" w:after="120"/>
+        <w:jc w:val="both"/>
+      </w:pPr>
+      <w:r>
+        <w:rPr>
+          <w:rFonts w:ascii="Times New Roman" w:hAnsi="Times New Roman"/>
+          <w:sz w:val="24"/>
+        </w:rPr>
+        <w:t>[13] pgvector Contributors. (2024). pgvector: Open-source vector similarity search for PostgreSQL. https://github.com/pgvector/pgvector</w:t>
       </w:r>
     </w:p>
     <w:p/>

</xml_diff>

<commit_message>
feat: Aurora Deck frontend redesign — dark premium AI theme
- FASE 1: Add Sora font + Aurora Deck design system (globals.css)
- FASE 2: Landing page dark redesign with glassmorphism, 3D tilt cards, aurora blobs
- FASE 3: Auth pages (login/register) dark glass card over aurora background
- FASE 4: AI Crew page — aurora-bg wrapper, gradient-text header, 3D tilt crew cards
- FASE 6: TiltCard component for interactive mouse-following 3D effect
- All CSS-first, no logic changes — zero risk of breaking functionality
</commit_message>
<xml_diff>
--- a/proposal_gemastik/Proposal_SoftwareDevelopment_Digiboom_JUALIN_AI.docx
+++ b/proposal_gemastik/Proposal_SoftwareDevelopment_Digiboom_JUALIN_AI.docx
@@ -180,6 +180,28 @@
         <w:br w:type="page"/>
       </w:r>
     </w:p>
+    <w:p>
+      <w:pPr>
+        <w:pStyle w:val="Heading1"/>
+      </w:pPr>
+      <w:r>
+        <w:t>Ringkasan</w:t>
+      </w:r>
+    </w:p>
+    <w:p>
+      <w:pPr>
+        <w:spacing w:line="360" w:lineRule="auto" w:after="120"/>
+        <w:jc w:val="both"/>
+      </w:pPr>
+      <w:r>
+        <w:rPr>
+          <w:rFonts w:ascii="Times New Roman" w:hAnsi="Times New Roman"/>
+          <w:sz w:val="24"/>
+        </w:rPr>
+        <w:t>Kami memulai JUALIN.AI dari hal sederhana yang kami lihat sendiri. Teman-teman kami yang berjualan online lewat WhatsApp selalu kewalahan. Chat masuk tengah malam, pembeli menawar, stok lupa diperbarui, dan tidak sedikit orderan batal hanya karena telat dibalas. Dari situ muncul pertanyaan kami, bagaimana kalau penjual kecil punya karyawan yang tidak pernah tidur? JUALIN.AI dalam edisi JUALIN OS adalah jawaban kami, yaitu bukan sekadar chatbot yang menjawab, melainkan satu tim agen AI yang menjalankan toko: melayani percakapan, menawar harga secara aman tanpa membuat penjual rugi, menjaga stok, menagih pembayaran, dan menyusun laporan harian, sementara keputusan penting tetap dipegang penjual. Proposal ini memaparkan latar masalah, rancangan, dan prototipe yang sudah berjalan, beserta rencana pengukuran dampaknya bagi UMKM mikro Indonesia.</w:t>
+      </w:r>
+    </w:p>
+    <w:p/>
     <w:p>
       <w:pPr>
         <w:pStyle w:val="Heading1"/>
@@ -867,7 +889,7 @@
           <w:rFonts w:ascii="Times New Roman" w:hAnsi="Times New Roman"/>
           <w:sz w:val="24"/>
         </w:rPr>
-        <w:t>UMKM adalah tulang punggung ekonomi Indonesia, menyumbang sekitar 60 persen Produk Domestik Bruto dan menyerap sekitar 97 persen tenaga kerja menurut Kementerian Koperasi dan UKM. Mayoritas dari sekitar 4,4 juta pelaku e-commerce nasional berjualan melalui pesan instan, bukan etalase marketplace, menurut Badan Pusat Statistik tahun 2024. Artinya, medan transaksi UMKM sesungguhnya adalah kotak chat, dan di sanalah penjual mikro paling kewalahan.</w:t>
+        <w:t>Ide ini tidak kami dapat dari laporan riset, melainkan dari apa yang kami lihat sehari-hari. Banyak teman dan tetangga kami berjualan baju, makanan, dan barang harian lewat WhatsApp dan Instagram. Mereka pandai membuat produk, tetapi kewalahan mengurus chat. Pesan menumpuk saat mereka sedang masak, mengantar anak, atau tidur. Saat ditawar, mereka ragu boleh turun berapa supaya tidak rugi. Orderan yang sudah dibuat pun sering batal hanya karena lupa ditagih. Dari situ kami sadar, masalahnya bukan pada produk, tetapi pada keterbatasan satu orang melayani semuanya sekaligus.</w:t>
       </w:r>
     </w:p>
     <w:p>
@@ -880,7 +902,20 @@
           <w:rFonts w:ascii="Times New Roman" w:hAnsi="Times New Roman"/>
           <w:sz w:val="24"/>
         </w:rPr>
-        <w:t>Seorang penjual mikro menanggung enam pekerjaan sekaligus dan sendirian: membalas chat selama 24 jam, melayani tawar-menawar, menagih pembayaran yang tertunda, menjaga stok agar tidak salah janji, menyapa kembali pelanggan lama, dan mencatat pembukuan. Setiap beban itu sebenarnya pekerjaan satu orang. Akibatnya peluang closing hilang bukan karena produk tidak menarik, melainkan karena respons dan proses penjualan tidak konsisten.</w:t>
+        <w:t>Pengamatan kami ternyata sejalan dengan data. UMKM menyumbang sekitar 60 persen Produk Domestik Bruto dan menyerap hampir 97 persen tenaga kerja Indonesia menurut Kementerian Koperasi dan UKM. Dari sekitar 4,4 juta pelaku e-commerce nasional, mayoritas justru berjualan lewat pesan instan, bukan etalase marketplace, menurut Badan Pusat Statistik tahun 2024. Artinya jutaan transaksi UMKM benar-benar terjadi di dalam kotak chat, dan di situlah penjual paling mudah kehabisan tenaga.</w:t>
+      </w:r>
+    </w:p>
+    <w:p>
+      <w:pPr>
+        <w:spacing w:line="360" w:lineRule="auto" w:after="120"/>
+        <w:jc w:val="both"/>
+      </w:pPr>
+      <w:r>
+        <w:rPr>
+          <w:rFonts w:ascii="Times New Roman" w:hAnsi="Times New Roman"/>
+          <w:sz w:val="24"/>
+        </w:rPr>
+        <w:t>Kalau dirinci, seorang penjual mikro sebenarnya mengerjakan enam peran sekaligus, sendirian:</w:t>
       </w:r>
     </w:p>
     <w:tbl>
@@ -1356,7 +1391,7 @@
           <w:rFonts w:ascii="Times New Roman" w:hAnsi="Times New Roman"/>
           <w:sz w:val="24"/>
         </w:rPr>
-        <w:t>Solusi yang sudah ada di pasar, yaitu chatbot customer service dan bot open-source, bersifat reaktif: menunggu pesan lalu menjawab. Tidak ada yang berinisiatif menagih, menawar, atau menyapa kembali, dan hampir tidak ada yang berani menego harga secara otomatis karena risiko jual-rugi. Padahal tawar-menawar adalah inti budaya dagang Indonesia. Di sinilah celah JUALIN OS, yaitu agen otonom sisi penjual yang menutup seluruh siklus penjualan, termasuk negosiasi yang aman.</w:t>
+        <w:t>Kami sempat mencoba beberapa chatbot yang sudah ada. Hampir semuanya reaktif, yaitu hanya menunggu pertanyaan lalu menjawab. Tidak ada yang berinisiatif menagih, menyapa pelanggan lama, apalagi berani menawar harga, padahal menawar justru bagian paling khas dari jual-beli di Indonesia. Dari sinilah kami yakin ada celah yang belum diisi siapa pun, yaitu AI yang benar-benar menjalankan toko di sisi penjual, termasuk menawar dengan aman.</w:t>
       </w:r>
     </w:p>
     <w:p>
@@ -1369,7 +1404,7 @@
           <w:rFonts w:ascii="Times New Roman" w:hAnsi="Times New Roman"/>
           <w:sz w:val="24"/>
         </w:rPr>
-        <w:t>Tren global memperkuat arah ini. Agentic commerce diproyeksikan menaikkan konversi sekitar 20 hingga 30 persen dan menjadi pasar di atas 50 miliar dolar Amerika Serikat pada tahun 2030, namun kapabilitasnya masih menumpuk di sisi pembeli dan bagian atas funnel. Sisi penjual serta tahap closing, pembayaran, dan retensi masih kosong, dan JUALIN OS mengisinya untuk konteks UMKM Indonesia.</w:t>
+        <w:t>Arah ini juga didukung tren global. Perdagangan yang dijalankan agen AI diperkirakan menaikkan konversi sekitar 20 sampai 30 persen dan menjadi pasar di atas 50 miliar dolar Amerika Serikat pada tahun 2030, tetapi hampir semuanya masih berfokus membantu pembeli, bukan penjual kecil. Kami merancang JUALIN OS untuk mengisi ruang kosong itu, dengan konteks dan bahasa yang akrab bagi UMKM Indonesia.</w:t>
       </w:r>
     </w:p>
     <w:p/>

</xml_diff>